<commit_message>
Updated lots of documents
Thesis proposal for Kelsey's review, survey materials, plan of study
</commit_message>
<xml_diff>
--- a/Documents /HRP-503_Protocol_BackyardBirdSurvey.docx
+++ b/Documents /HRP-503_Protocol_BackyardBirdSurvey.docx
@@ -957,7 +957,27 @@
               <w:sz w:val="22"/>
               <w:szCs w:val="22"/>
             </w:rPr>
-            <w:t>Version 1- August 13,2026</w:t>
+            <w:t xml:space="preserve">Version 1- </w:t>
+          </w:r>
+          <w:r>
+            <w:rPr>
+              <w:rFonts w:ascii="Arial" w:hAnsi="Arial" w:cs="Arial"/>
+              <w:iCs/>
+              <w:color w:val="auto"/>
+              <w:sz w:val="22"/>
+              <w:szCs w:val="22"/>
+            </w:rPr>
+            <w:t>September 24</w:t>
+          </w:r>
+          <w:r>
+            <w:rPr>
+              <w:rFonts w:ascii="Arial" w:hAnsi="Arial" w:cs="Arial"/>
+              <w:iCs/>
+              <w:color w:val="auto"/>
+              <w:sz w:val="22"/>
+              <w:szCs w:val="22"/>
+            </w:rPr>
+            <w:t>,2026</w:t>
           </w:r>
         </w:sdtContent>
       </w:sdt>
@@ -1136,7 +1156,7 @@
                 <w:rFonts w:cs="Arial"/>
                 <w:sz w:val="22"/>
               </w:rPr>
-              <w:t>06 August 2026</w:t>
+              <w:t>24 September 2026</w:t>
             </w:r>
           </w:p>
         </w:tc>
@@ -3788,13 +3808,35 @@
                       <w:color w:val="000000" w:themeColor="text1"/>
                       <w:sz w:val="22"/>
                     </w:rPr>
-                    <w:t>, i.e., homeowners participating in the study associated with Aim 1 and 2 who also voluntarily agree to participate in Aim 3</w:t>
+                    <w:t xml:space="preserve">, i.e., </w:t>
+                  </w:r>
+                  <w:r>
+                    <w:rPr>
+                      <w:rFonts w:ascii="Arial" w:hAnsi="Arial" w:cs="Arial"/>
+                      <w:color w:val="000000" w:themeColor="text1"/>
+                      <w:sz w:val="22"/>
+                    </w:rPr>
+                    <w:t xml:space="preserve">adults who feed backyard birds, and/or keep backyard poultry, or have interest and knowledge of these activities, who </w:t>
+                  </w:r>
+                  <w:r>
+                    <w:rPr>
+                      <w:rFonts w:ascii="Arial" w:hAnsi="Arial" w:cs="Arial"/>
+                      <w:color w:val="000000" w:themeColor="text1"/>
+                      <w:sz w:val="22"/>
+                    </w:rPr>
+                    <w:t>voluntarily agree to participate in Aim 3</w:t>
                   </w:r>
                   <w:r>
                     <w:rPr>
                       <w:color w:val="000000" w:themeColor="text1"/>
                     </w:rPr>
                     <w:t>.</w:t>
+                  </w:r>
+                  <w:r>
+                    <w:rPr>
+                      <w:color w:val="000000" w:themeColor="text1"/>
+                    </w:rPr>
+                    <w:t xml:space="preserve"> </w:t>
                   </w:r>
                 </w:p>
                 <w:p>
@@ -4579,7 +4621,15 @@
               <w:color w:val="000000" w:themeColor="text1"/>
               <w:sz w:val="22"/>
             </w:rPr>
-            <w:t>This study will employ a cross-sectional survey research design -- Participants will be recruited from individuals already enrolled in the broader project and participating in the natural science components of the study (Aims 1 and 2), which involve monitoring birds and assessing pathogen prevalence in residential yards. Eligibility for this component of the research will be limited to adult homeowners who voluntarily agree to participate in Aim 3.</w:t>
+            <w:t xml:space="preserve">This study will employ a cross-sectional survey research design -- Participants will be recruited </w:t>
+          </w:r>
+          <w:r>
+            <w:rPr>
+              <w:rFonts w:ascii="Arial" w:hAnsi="Arial" w:cs="Arial"/>
+              <w:color w:val="000000" w:themeColor="text1"/>
+              <w:sz w:val="22"/>
+            </w:rPr>
+            <w:t xml:space="preserve">two groups: (1) individuals already participating in the field study, which involves monitoring wild birds and backyard poultry and assessing pathogen prevalence (hereafter, “field-study participants”), and (2) members of the public who receive the survey invitation via email/newsletter; this will most likely be through local outreach systems such as the Alabama Cooperative Extension program, and local interest groups that advertise similar activities (hereafter, “general-audience participants”). Eligibility for this component of the research will be limited to adults who engage in backyard activities like bird-feeding and poultry keeping or have interest and knowledge of them and volunteer to take the survey. Both groups complete the same survey instrument, but may only take certain portions, relevant to their knowledge and current practices. </w:t>
           </w:r>
         </w:p>
         <w:p>
@@ -4625,7 +4675,40 @@
               <w:color w:val="000000" w:themeColor="text1"/>
               <w:sz w:val="22"/>
             </w:rPr>
-            <w:t>Survey responses will be collected at a single point in time. Rather than collecting names or other directly identifying information, each participant's responses will be labeled with a unique site identification code. This code links the survey responses to the biological and environmental data collected at that household through Aims 1 and 2. The list connecting site identification codes to participating households will be maintained separately from the survey data and from any file containing participant names, in an access-restricted, password-protected location available only to the Principal Investigator and the graduate student researcher (see Section 19.0).</w:t>
+            <w:t xml:space="preserve">Survey responses will be collected at a single point in time. Rather than collecting names or other directly identifying information, each </w:t>
+          </w:r>
+          <w:r>
+            <w:rPr>
+              <w:rFonts w:ascii="Arial" w:hAnsi="Arial" w:cs="Arial"/>
+              <w:color w:val="000000" w:themeColor="text1"/>
+              <w:sz w:val="22"/>
+            </w:rPr>
+            <w:t xml:space="preserve">field-study </w:t>
+          </w:r>
+          <w:r>
+            <w:rPr>
+              <w:rFonts w:ascii="Arial" w:hAnsi="Arial" w:cs="Arial"/>
+              <w:color w:val="000000" w:themeColor="text1"/>
+              <w:sz w:val="22"/>
+            </w:rPr>
+            <w:t>participant's responses will be labeled with a unique site identification code. This code links the survey responses to the biological and environmental data collected at that household through Aims 1 and 2. The list connecting site identification codes to participating households will be maintained separately from the survey data and from any file containing participant names, in an access-restricted, password-protected location available only to the Principal Investigator and the graduate student researcher (see Section 19.0).</w:t>
+          </w:r>
+          <w:r>
+            <w:rPr>
+              <w:rFonts w:ascii="Arial" w:hAnsi="Arial" w:cs="Arial"/>
+              <w:color w:val="000000" w:themeColor="text1"/>
+              <w:sz w:val="22"/>
+            </w:rPr>
+            <w:t xml:space="preserve"> General-</w:t>
+          </w:r>
+          <w:r>
+            <w:rPr>
+              <w:rFonts w:ascii="Arial" w:hAnsi="Arial" w:cs="Arial"/>
+              <w:color w:val="000000" w:themeColor="text1"/>
+              <w:sz w:val="22"/>
+            </w:rPr>
+            <w:lastRenderedPageBreak/>
+            <w:t xml:space="preserve">audience participants access the survey through a single public link/QR code; their responses are not labeled with any identifiers and are anonymous. </w:t>
           </w:r>
         </w:p>
         <w:p>
@@ -4671,7 +4754,6 @@
               <w:color w:val="000000" w:themeColor="text1"/>
               <w:sz w:val="22"/>
             </w:rPr>
-            <w:lastRenderedPageBreak/>
             <w:t>Findings may also be compared with pathogen prevalence data collected through the broader study to explore potential associations between human behaviors and disease outcomes</w:t>
           </w:r>
         </w:p>
@@ -4778,7 +4860,7 @@
               <w:color w:val="auto"/>
               <w:sz w:val="22"/>
             </w:rPr>
-            <w:t>Eligible adults will be invited to participate (see Section 14.0) and will be given the survey link by email or in person during a field visit. They access the survey by following the link to the Qualtrics instrument, which they may complete at a time and location of their choosing</w:t>
+            <w:t>Eligible adults will be invited to participate (see Section 14.0.</w:t>
           </w:r>
           <w:r>
             <w:rPr>
@@ -4786,7 +4868,95 @@
               <w:color w:val="auto"/>
               <w:sz w:val="22"/>
             </w:rPr>
-            <w:t>. A paper version of the same questionnaire will be offered as an alternative for participants who prefer not to complete the survey online. Paper surveys will contain no participant name or contact information; each will be labeled only with the participant’s site identification code and returned to the researcher in a sealed envelope. Completed paper responses are identified by site code rather than by name, and the list linking codes to households is stored separately and securely (see Section 19.0). Each prospective participant will receive one initial invitation followed by up to two reminder contacts before recruitment closes. Completion of the survey is expected to take approximately 10 to 15 minutes.</w:t>
+            <w:t xml:space="preserve"> Field-study participants will be given a </w:t>
+          </w:r>
+          <w:r>
+            <w:rPr>
+              <w:rFonts w:ascii="Arial" w:hAnsi="Arial" w:cs="Arial"/>
+              <w:color w:val="auto"/>
+              <w:sz w:val="22"/>
+            </w:rPr>
+            <w:t>personal</w:t>
+          </w:r>
+          <w:r>
+            <w:rPr>
+              <w:rFonts w:ascii="Arial" w:hAnsi="Arial" w:cs="Arial"/>
+              <w:color w:val="auto"/>
+              <w:sz w:val="22"/>
+            </w:rPr>
+            <w:t xml:space="preserve"> survey link </w:t>
+          </w:r>
+          <w:r>
+            <w:rPr>
+              <w:rFonts w:ascii="Arial" w:hAnsi="Arial" w:cs="Arial"/>
+              <w:color w:val="auto"/>
+              <w:sz w:val="22"/>
+            </w:rPr>
+            <w:t>by email or in-person; general-audience participants will receive a public survey link through email newsletter.</w:t>
+          </w:r>
+          <w:r>
+            <w:rPr>
+              <w:rFonts w:ascii="Arial" w:hAnsi="Arial" w:cs="Arial"/>
+              <w:color w:val="auto"/>
+              <w:sz w:val="22"/>
+            </w:rPr>
+            <w:t xml:space="preserve"> They access the survey by following the link to the Qualtrics instrument, which they may complete at a time and location of their choosing</w:t>
+          </w:r>
+          <w:r>
+            <w:rPr>
+              <w:rFonts w:ascii="Arial" w:hAnsi="Arial" w:cs="Arial"/>
+              <w:color w:val="auto"/>
+              <w:sz w:val="22"/>
+            </w:rPr>
+            <w:t>. A paper version of the same questionnaire will be offered as an alternative for</w:t>
+          </w:r>
+          <w:r>
+            <w:rPr>
+              <w:rFonts w:ascii="Arial" w:hAnsi="Arial" w:cs="Arial"/>
+              <w:color w:val="auto"/>
+              <w:sz w:val="22"/>
+            </w:rPr>
+            <w:t xml:space="preserve"> field-study</w:t>
+          </w:r>
+          <w:r>
+            <w:rPr>
+              <w:rFonts w:ascii="Arial" w:hAnsi="Arial" w:cs="Arial"/>
+              <w:color w:val="auto"/>
+              <w:sz w:val="22"/>
+            </w:rPr>
+            <w:t xml:space="preserve"> participants who prefer not to complete the survey online. Paper surveys will contain no participant name or contact information; each will be labeled only with the participant’s site identification code and returned to the researcher in a sealed envelope. Completed paper responses are identified by site code rather than by name, and the list linking codes to households is stored separately and securely (see Section 19.0). Each </w:t>
+          </w:r>
+          <w:r>
+            <w:rPr>
+              <w:rFonts w:ascii="Arial" w:hAnsi="Arial" w:cs="Arial"/>
+              <w:color w:val="auto"/>
+              <w:sz w:val="22"/>
+            </w:rPr>
+            <w:t xml:space="preserve">field-study </w:t>
+          </w:r>
+          <w:r>
+            <w:rPr>
+              <w:rFonts w:ascii="Arial" w:hAnsi="Arial" w:cs="Arial"/>
+              <w:color w:val="auto"/>
+              <w:sz w:val="22"/>
+            </w:rPr>
+            <w:t>participant will receive one initial invitation followed by up to two reminder contacts before recruitment closes</w:t>
+          </w:r>
+          <w:r>
+            <w:rPr>
+              <w:rFonts w:ascii="Arial" w:hAnsi="Arial" w:cs="Arial"/>
+              <w:color w:val="auto"/>
+              <w:sz w:val="22"/>
+            </w:rPr>
+            <w:t>; the general-audience participants will only receive the initial email invitation</w:t>
+          </w:r>
+          <w:r>
+            <w:rPr>
+              <w:rFonts w:ascii="Arial" w:hAnsi="Arial" w:cs="Arial"/>
+              <w:color w:val="auto"/>
+              <w:sz w:val="22"/>
+            </w:rPr>
+            <w:t>. Completion of the survey is expected to take approximately 10 to 15 minutes.</w:t>
           </w:r>
         </w:p>
       </w:sdtContent>
@@ -4953,7 +5123,15 @@
           <w:rFonts w:ascii="Arial" w:hAnsi="Arial" w:cs="Arial"/>
           <w:sz w:val="22"/>
         </w:rPr>
-        <w:t xml:space="preserve">Describe all data that will be collected during the study and how those data will be obtained. Distinguish between: (a) data collected from research-specific study procedures, (b) observation/data collected from standard operation procedures, programs, classroom activities, etc., and/or (c) data obtained from pre-existing source records (e.g., medical records, academic records, etc.), as applicable. </w:t>
+        <w:t xml:space="preserve">Describe all data that will be collected during the study and how those data will be obtained. Distinguish between: (a) data collected from research-specific study procedures, (b) observation/data collected from standard operation procedures, programs, classroom activities, etc., and/or (c) data </w:t>
+      </w:r>
+      <w:r>
+        <w:rPr>
+          <w:rFonts w:ascii="Arial" w:hAnsi="Arial" w:cs="Arial"/>
+          <w:sz w:val="22"/>
+        </w:rPr>
+        <w:lastRenderedPageBreak/>
+        <w:t xml:space="preserve">obtained from pre-existing source records (e.g., medical records, academic records, etc.), as applicable. </w:t>
       </w:r>
     </w:p>
     <w:p>
@@ -5002,7 +5180,6 @@
           <w:bCs/>
           <w:sz w:val="22"/>
         </w:rPr>
-        <w:lastRenderedPageBreak/>
         <w:t xml:space="preserve">Upload all surveys, interview scripts, and data collection forms to the respective section of the “Local Site </w:t>
       </w:r>
       <w:r>
@@ -5089,7 +5266,65 @@
               <w:color w:val="000000" w:themeColor="text1"/>
               <w:sz w:val="22"/>
             </w:rPr>
-            <w:t>Findings from these survey data may be examined in relation to pathogen-prevalence and environmental data generated through the associated field and laboratory objectives (Aims 1 and 2, reviewed under IACUC protocol IPROTO202500000090). Survey responses are labeled with a unique site identification code that links them to the biological and environmental data collected at that household, allowing associations between reported backyard practices and patterns of disease risk to be examined at the household and site level. Responses are coded rather than anonymous; no directly identifying information is collected through the survey, and the list linking site codes to households is stored separately and securely (see Section 19.0).</w:t>
+            <w:t>Findings from these survey data may be examined in relation to pathogen-prevalence and environmental data generated through the associated field and laboratory objectives (Aims 1 and 2, reviewed under IACUC protocol IPROTO202500000090). Survey responses</w:t>
+          </w:r>
+          <w:r>
+            <w:rPr>
+              <w:rFonts w:ascii="Arial" w:hAnsi="Arial" w:cs="Arial"/>
+              <w:color w:val="000000" w:themeColor="text1"/>
+              <w:sz w:val="22"/>
+            </w:rPr>
+            <w:t xml:space="preserve"> from field-study participants</w:t>
+          </w:r>
+          <w:r>
+            <w:rPr>
+              <w:rFonts w:ascii="Arial" w:hAnsi="Arial" w:cs="Arial"/>
+              <w:color w:val="000000" w:themeColor="text1"/>
+              <w:sz w:val="22"/>
+            </w:rPr>
+            <w:t xml:space="preserve"> are labeled with a unique site identification code that links them to the biological and environmental data collected at that household, allowing associations between reported backyard practices and patterns of disease risk to be examined at the household and site level. </w:t>
+          </w:r>
+          <w:r>
+            <w:rPr>
+              <w:rFonts w:ascii="Arial" w:hAnsi="Arial" w:cs="Arial"/>
+              <w:color w:val="000000" w:themeColor="text1"/>
+              <w:sz w:val="22"/>
+            </w:rPr>
+            <w:t>These responses</w:t>
+          </w:r>
+          <w:r>
+            <w:rPr>
+              <w:rFonts w:ascii="Arial" w:hAnsi="Arial" w:cs="Arial"/>
+              <w:color w:val="000000" w:themeColor="text1"/>
+              <w:sz w:val="22"/>
+            </w:rPr>
+            <w:t xml:space="preserve"> are coded rather than anonymous; </w:t>
+          </w:r>
+          <w:proofErr w:type="gramStart"/>
+          <w:r>
+            <w:rPr>
+              <w:rFonts w:ascii="Arial" w:hAnsi="Arial" w:cs="Arial"/>
+              <w:color w:val="000000" w:themeColor="text1"/>
+              <w:sz w:val="22"/>
+            </w:rPr>
+            <w:t>no</w:t>
+          </w:r>
+          <w:proofErr w:type="gramEnd"/>
+          <w:r>
+            <w:rPr>
+              <w:rFonts w:ascii="Arial" w:hAnsi="Arial" w:cs="Arial"/>
+              <w:color w:val="000000" w:themeColor="text1"/>
+              <w:sz w:val="22"/>
+            </w:rPr>
+            <w:t xml:space="preserve"> directly identifying information is collected through the survey, and the list linking site codes to households is stored separately and securely (see Section 19.0).</w:t>
+          </w:r>
+          <w:r>
+            <w:rPr>
+              <w:rFonts w:ascii="Arial" w:hAnsi="Arial" w:cs="Arial"/>
+              <w:color w:val="000000" w:themeColor="text1"/>
+              <w:sz w:val="22"/>
+            </w:rPr>
+            <w:t xml:space="preserve"> Responses from general audience participants carry no site code, are anonymous, and will be analyzed only in aggregate. </w:t>
           </w:r>
         </w:p>
       </w:sdtContent>
@@ -5240,6 +5475,7 @@
           <w:rFonts w:ascii="Arial" w:hAnsi="Arial" w:cs="Arial"/>
           <w:sz w:val="22"/>
         </w:rPr>
+        <w:lastRenderedPageBreak/>
         <w:t>How subject data will be used by the AI.</w:t>
       </w:r>
     </w:p>
@@ -5360,7 +5596,6 @@
           <w:rFonts w:ascii="Arial" w:hAnsi="Arial" w:cs="Arial"/>
           <w:sz w:val="22"/>
         </w:rPr>
-        <w:lastRenderedPageBreak/>
         <w:t>The intended use of AI technology in the research (including whether it is a standard or novel application).</w:t>
       </w:r>
     </w:p>
@@ -6499,35 +6734,35 @@
               <w:rFonts w:cs="Arial"/>
               <w:sz w:val="22"/>
             </w:rPr>
-            <w:t xml:space="preserve">The survey will be completed by participants at a location of their own choosing, most often in or around their own homes. The survey is not administered at a fixed research site. Eligible </w:t>
+            <w:t xml:space="preserve">The survey will be completed by participants at a location of their own choosing, most often in or around their own homes. The survey is not administered at a fixed research site. </w:t>
           </w:r>
           <w:r>
             <w:rPr>
               <w:rFonts w:cs="Arial"/>
               <w:sz w:val="22"/>
             </w:rPr>
-            <w:t>participants</w:t>
+            <w:t>Field-study participants will be given access by email or in-person, either by being provided a personal</w:t>
           </w:r>
           <w:r>
             <w:rPr>
               <w:rFonts w:cs="Arial"/>
               <w:sz w:val="22"/>
             </w:rPr>
-            <w:t xml:space="preserve"> </w:t>
+            <w:t xml:space="preserve"> link to the online Qualtrics questionnaire or, for those who prefer, a paper copy of the same questionnaire labeled only with the participant's site identification code and no name or contact information.</w:t>
           </w:r>
           <w:r>
             <w:rPr>
               <w:rFonts w:cs="Arial"/>
               <w:sz w:val="22"/>
             </w:rPr>
-            <w:t>will be given access by email or in person at the time of a field visit, either by being provided a direct link to the online Qualtrics questionnaire or, for those who prefer, a paper copy of the same questionnaire labeled only with the participant's site identification code and no name or contact information.</w:t>
+            <w:t xml:space="preserve"> Online responses are submitted directly through Qualtrics upon completion, and paper responses are returned in a sealed envelope and are identified by site code rather than by name.</w:t>
           </w:r>
           <w:r>
             <w:rPr>
               <w:rFonts w:cs="Arial"/>
               <w:sz w:val="22"/>
             </w:rPr>
-            <w:t xml:space="preserve"> Online responses are submitted directly through Qualtrics upon completion, and paper responses are returned in a sealed envelope and are identified by site code rather than by name.</w:t>
+            <w:t xml:space="preserve"> General-audience participants will access the online questionnaire through a public link, accessed from an email/newsletter. </w:t>
           </w:r>
         </w:p>
       </w:sdtContent>
@@ -7114,7 +7349,15 @@
               <w:color w:val="auto"/>
               <w:sz w:val="22"/>
             </w:rPr>
-            <w:t>Study results will be shared with participants after all data have been collected, analyzed, and interpreted. No individual-level results will be returned; only aggregate, study-wide findings will be shared. A summary of key takeaways will be made available to interested participants, for example through a mailed or emailed fact sheet. A central goal of this research is to translate these findings into evidence-based, accessible biosecurity and management guidance for homeowners who feed backyard birds and/or keep backyard poultry, and this material will be shared with participants as it is developed.</w:t>
+            <w:t>Study results will be shared with participants after all data have been collected, analyzed, and interpreted. No individual-level results will be returned; only aggregate, study-wide findings will be shared. A central goal of this research is to translate these findings into evidence-based, accessible biosecurity and management guidance for homeowners who feed backyard birds and/or keep backyard poultry, and this material will be shared with participants as it is developed</w:t>
+          </w:r>
+          <w:r>
+            <w:rPr>
+              <w:rFonts w:ascii="Arial" w:hAnsi="Arial" w:cs="Arial"/>
+              <w:color w:val="auto"/>
+              <w:sz w:val="22"/>
+            </w:rPr>
+            <w:t xml:space="preserve">/published. </w:t>
           </w:r>
         </w:p>
       </w:sdtContent>
@@ -7248,7 +7491,6 @@
           <w:color w:val="auto"/>
           <w:sz w:val="22"/>
         </w:rPr>
-        <w:lastRenderedPageBreak/>
         <w:t>Describe the duration anticipated to enroll all study Participants. (How long will the study be open to enrollment to meet the recruitment goals?)</w:t>
       </w:r>
     </w:p>
@@ -7462,7 +7704,15 @@
               <w:color w:val="000000" w:themeColor="text1"/>
               <w:sz w:val="22"/>
             </w:rPr>
-            <w:t>Participating in the previous/companion study.</w:t>
+            <w:t>Participating in the previous/companion study</w:t>
+          </w:r>
+          <w:r>
+            <w:rPr>
+              <w:rFonts w:ascii="Arial" w:hAnsi="Arial" w:cs="Arial"/>
+              <w:color w:val="000000" w:themeColor="text1"/>
+              <w:sz w:val="22"/>
+            </w:rPr>
+            <w:t>, OR participates in backyard bird feeding/poultry keeping, OR has knowledge and interest in these activities (Is not required to be a participant in the broader study)</w:t>
           </w:r>
         </w:p>
         <w:p>
@@ -7489,7 +7739,7 @@
               <w:color w:val="000000" w:themeColor="text1"/>
               <w:sz w:val="22"/>
             </w:rPr>
-            <w:t>Over the age of 18 (IRB requirement)</w:t>
+            <w:t>Lives in the Southeastern U.S.</w:t>
           </w:r>
         </w:p>
         <w:p>
@@ -7516,7 +7766,34 @@
               <w:color w:val="000000" w:themeColor="text1"/>
               <w:sz w:val="22"/>
             </w:rPr>
-            <w:t xml:space="preserve">Voluntarily participating. </w:t>
+            <w:t>Over the age of 18 (IRB requirement)</w:t>
+          </w:r>
+        </w:p>
+        <w:p>
+          <w:pPr>
+            <w:pStyle w:val="BlockText"/>
+            <w:numPr>
+              <w:ilvl w:val="0"/>
+              <w:numId w:val="12"/>
+            </w:numPr>
+            <w:autoSpaceDE/>
+            <w:autoSpaceDN/>
+            <w:adjustRightInd/>
+            <w:spacing w:before="120" w:after="120"/>
+            <w:ind w:right="720"/>
+            <w:rPr>
+              <w:rFonts w:ascii="Arial" w:hAnsi="Arial" w:cs="Arial"/>
+              <w:color w:val="000000" w:themeColor="text1"/>
+              <w:sz w:val="22"/>
+            </w:rPr>
+          </w:pPr>
+          <w:r>
+            <w:rPr>
+              <w:rFonts w:ascii="Arial" w:hAnsi="Arial" w:cs="Arial"/>
+              <w:color w:val="000000" w:themeColor="text1"/>
+              <w:sz w:val="22"/>
+            </w:rPr>
+            <w:t>Voluntarily participating</w:t>
           </w:r>
         </w:p>
         <w:p>
@@ -7596,11 +7873,15 @@
         <w:p>
           <w:pPr>
             <w:pStyle w:val="BlockText"/>
+            <w:numPr>
+              <w:ilvl w:val="0"/>
+              <w:numId w:val="13"/>
+            </w:numPr>
             <w:autoSpaceDE/>
             <w:autoSpaceDN/>
             <w:adjustRightInd/>
             <w:spacing w:before="120" w:after="120"/>
-            <w:ind w:left="720" w:right="720"/>
+            <w:ind w:right="720"/>
             <w:rPr>
               <w:rFonts w:ascii="Arial" w:hAnsi="Arial" w:cs="Arial"/>
               <w:color w:val="000000" w:themeColor="text1"/>
@@ -7613,7 +7894,34 @@
               <w:color w:val="000000" w:themeColor="text1"/>
               <w:sz w:val="22"/>
             </w:rPr>
-            <w:t>(1) Not participating in the previous/companion study.</w:t>
+            <w:t xml:space="preserve">Does not participate in any of the relevant activities, nor have knowledge or interest in them. </w:t>
+          </w:r>
+        </w:p>
+        <w:p>
+          <w:pPr>
+            <w:pStyle w:val="BlockText"/>
+            <w:numPr>
+              <w:ilvl w:val="0"/>
+              <w:numId w:val="13"/>
+            </w:numPr>
+            <w:autoSpaceDE/>
+            <w:autoSpaceDN/>
+            <w:adjustRightInd/>
+            <w:spacing w:before="120" w:after="120"/>
+            <w:ind w:right="720"/>
+            <w:rPr>
+              <w:rFonts w:ascii="Arial" w:hAnsi="Arial" w:cs="Arial"/>
+              <w:color w:val="000000" w:themeColor="text1"/>
+              <w:sz w:val="22"/>
+            </w:rPr>
+          </w:pPr>
+          <w:r>
+            <w:rPr>
+              <w:rFonts w:ascii="Arial" w:hAnsi="Arial" w:cs="Arial"/>
+              <w:color w:val="000000" w:themeColor="text1"/>
+              <w:sz w:val="22"/>
+            </w:rPr>
+            <w:t xml:space="preserve">Does not live in the Southeastern U.S. </w:t>
           </w:r>
         </w:p>
         <w:p>
@@ -8895,14 +9203,14 @@
           <w:color w:val="auto"/>
           <w:sz w:val="22"/>
         </w:rPr>
+        <w:lastRenderedPageBreak/>
         <w:t>Indicate the total number of Participants to be accrued, if known.  If applicable, provide a sample size justification based on existing literature, power analysis, or other applicable methods.</w:t>
       </w:r>
     </w:p>
     <w:sdt>
       <w:sdtPr>
         <w:rPr>
-          <w:rFonts w:ascii="Arial" w:hAnsi="Arial" w:cs="Arial"/>
-          <w:color w:val="auto"/>
+          <w:rFonts w:cs="Arial"/>
           <w:sz w:val="22"/>
         </w:rPr>
         <w:id w:val="-2134623063"/>
@@ -8913,40 +9221,118 @@
       <w:sdtContent>
         <w:p>
           <w:pPr>
-            <w:pStyle w:val="BlockText"/>
-            <w:pBdr>
-              <w:top w:val="none" w:sz="0" w:space="0" w:color="auto"/>
-              <w:left w:val="none" w:sz="0" w:space="0" w:color="auto"/>
-              <w:bottom w:val="none" w:sz="0" w:space="0" w:color="auto"/>
-              <w:right w:val="none" w:sz="0" w:space="0" w:color="auto"/>
-            </w:pBdr>
             <w:autoSpaceDE/>
             <w:autoSpaceDN/>
             <w:adjustRightInd/>
-            <w:spacing w:before="120" w:after="120"/>
-            <w:ind w:left="720" w:right="720"/>
-            <w:rPr>
-              <w:rFonts w:ascii="Arial" w:hAnsi="Arial" w:cs="Arial"/>
-              <w:color w:val="auto"/>
+            <w:rPr>
+              <w:rFonts w:eastAsia="Times New Roman" w:cs="Arial"/>
+              <w:color w:val="000000"/>
               <w:sz w:val="22"/>
             </w:rPr>
           </w:pPr>
           <w:r>
             <w:rPr>
-              <w:rFonts w:ascii="Arial" w:hAnsi="Arial" w:cs="Arial"/>
-              <w:color w:val="auto"/>
-              <w:sz w:val="22"/>
-            </w:rPr>
-            <w:t xml:space="preserve">This is novel, exploratory research, and the aim is not to achieve a large sample size but to gather initial, in-depth information on the human dimensions of backyard disease risk. Participants will be drawn from the homeowners already enrolled in the associated field-sampling project, which currently includes approximately 13 households. We aim to invite all enrolled households to complete the survey, with the expectation that one voluntary adult per household will participate. Given the exploratory nature of this work and the modest size of </w:t>
-          </w:r>
-          <w:r>
-            <w:rPr>
-              <w:rFonts w:ascii="Arial" w:hAnsi="Arial" w:cs="Arial"/>
-              <w:color w:val="auto"/>
-              <w:sz w:val="22"/>
-            </w:rPr>
-            <w:lastRenderedPageBreak/>
-            <w:t>the enrolled pool, actual enrollment is anticipated to be small, and findings are intended to characterize participant perspectives and generate hypotheses rather than to support large-scale statistical inference.</w:t>
+              <w:rFonts w:cs="Arial"/>
+              <w:sz w:val="22"/>
+            </w:rPr>
+            <w:t>This is novel, exploratory research, and the aim is not to achieve a large sample size but to gather initial, in-depth information on the human dimensions of backyard disease risk. Participants will be drawn from</w:t>
+          </w:r>
+          <w:r>
+            <w:rPr>
+              <w:rFonts w:eastAsia="Times New Roman" w:cs="Arial"/>
+              <w:color w:val="000000"/>
+              <w:szCs w:val="24"/>
+            </w:rPr>
+            <w:t xml:space="preserve"> </w:t>
+          </w:r>
+          <w:ins w:id="22" w:author="Unknown" w:date="2026-09-24T00:00:00Z">
+            <w:r>
+              <w:rPr>
+                <w:rFonts w:eastAsia="Times New Roman" w:cs="Arial"/>
+                <w:color w:val="000000"/>
+                <w:sz w:val="22"/>
+              </w:rPr>
+              <w:t>two groups: the homeowners already enrolled in the associated field projec</w:t>
+            </w:r>
+          </w:ins>
+          <w:r>
+            <w:rPr>
+              <w:rFonts w:eastAsia="Times New Roman" w:cs="Arial"/>
+              <w:color w:val="000000"/>
+              <w:sz w:val="22"/>
+            </w:rPr>
+            <w:t>t</w:t>
+          </w:r>
+          <w:ins w:id="23" w:author="Unknown" w:date="2026-09-24T00:00:00Z">
+            <w:r>
+              <w:rPr>
+                <w:rFonts w:eastAsia="Times New Roman" w:cs="Arial"/>
+                <w:color w:val="000000"/>
+                <w:sz w:val="22"/>
+              </w:rPr>
+              <w:t xml:space="preserve">, and members of the public reached through the </w:t>
+            </w:r>
+          </w:ins>
+          <w:r>
+            <w:rPr>
+              <w:rFonts w:eastAsia="Times New Roman" w:cs="Arial"/>
+              <w:color w:val="000000"/>
+              <w:sz w:val="22"/>
+            </w:rPr>
+            <w:t>email</w:t>
+          </w:r>
+          <w:ins w:id="24" w:author="Unknown" w:date="2026-09-24T00:00:00Z">
+            <w:r>
+              <w:rPr>
+                <w:rFonts w:eastAsia="Times New Roman" w:cs="Arial"/>
+                <w:color w:val="000000"/>
+                <w:sz w:val="22"/>
+              </w:rPr>
+              <w:t xml:space="preserve"> and newsletter, which reach approximately </w:t>
+            </w:r>
+          </w:ins>
+          <w:r>
+            <w:rPr>
+              <w:rFonts w:eastAsia="Times New Roman" w:cs="Arial"/>
+              <w:color w:val="000000"/>
+              <w:sz w:val="22"/>
+            </w:rPr>
+            <w:t>~250</w:t>
+          </w:r>
+          <w:ins w:id="25" w:author="Unknown" w:date="2026-09-24T00:00:00Z">
+            <w:r>
+              <w:rPr>
+                <w:rFonts w:eastAsia="Times New Roman" w:cs="Arial"/>
+                <w:color w:val="000000"/>
+                <w:sz w:val="22"/>
+              </w:rPr>
+              <w:t xml:space="preserve"> subscribers. We aim to invite all enrolled households to complete the survey, with the expectation that one voluntary adult per household will participate. Because general-audience participants self-select from a list distributed by a third party, their number cannot be set in advance; we anticipate approximately </w:t>
+            </w:r>
+          </w:ins>
+          <w:r>
+            <w:rPr>
+              <w:rFonts w:eastAsia="Times New Roman" w:cs="Arial"/>
+              <w:color w:val="000000"/>
+              <w:sz w:val="22"/>
+            </w:rPr>
+            <w:t>~50</w:t>
+          </w:r>
+          <w:ins w:id="26" w:author="Unknown" w:date="2026-09-24T00:00:00Z">
+            <w:r>
+              <w:rPr>
+                <w:rFonts w:eastAsia="Times New Roman" w:cs="Arial"/>
+                <w:color w:val="000000"/>
+                <w:sz w:val="22"/>
+              </w:rPr>
+              <w:t xml:space="preserve"> general-audience respondents. Given the exploratory nature of this work, actual enrollment is anticipated to be modest</w:t>
+            </w:r>
+          </w:ins>
+          <w:r>
+            <w:rPr>
+              <w:rFonts w:cs="Arial"/>
+              <w:sz w:val="22"/>
+            </w:rPr>
+            <w:t>, and findings are intended to characterize participant perspectives and generate hypotheses rather than to support large-scale statistical inference.</w:t>
           </w:r>
         </w:p>
       </w:sdtContent>
@@ -8981,7 +9367,7 @@
           <w:rFonts w:ascii="Arial" w:hAnsi="Arial" w:cs="Arial"/>
         </w:rPr>
       </w:pPr>
-      <w:bookmarkStart w:id="22" w:name="_Toc226630101"/>
+      <w:bookmarkStart w:id="27" w:name="_Toc226630101"/>
       <w:r>
         <w:rPr>
           <w:rFonts w:ascii="Arial" w:hAnsi="Arial" w:cs="Arial"/>
@@ -9003,7 +9389,7 @@
         </w:rPr>
         <w:t xml:space="preserve"> within Endeavor)</w:t>
       </w:r>
-      <w:bookmarkEnd w:id="22"/>
+      <w:bookmarkEnd w:id="27"/>
     </w:p>
     <w:p>
       <w:pPr>
@@ -9110,7 +9496,7 @@
               <w:color w:val="auto"/>
               <w:sz w:val="22"/>
             </w:rPr>
-            <w:t>Homeowners who agree will be given access to the online survey through a direct Qualtrics link (provided by email or shared in person) or, if preferred, a paper copy of the same questionnaire labeled only with the participant's site identification code</w:t>
+            <w:t xml:space="preserve">Homeowners who agree will be given access to the online survey through a </w:t>
           </w:r>
           <w:r>
             <w:rPr>
@@ -9118,7 +9504,7 @@
               <w:color w:val="auto"/>
               <w:sz w:val="22"/>
             </w:rPr>
-            <w:t>. All eligible homeowners are drawn from those already enrolled in the associated</w:t>
+            <w:t>personal</w:t>
           </w:r>
           <w:r>
             <w:rPr>
@@ -9126,6 +9512,38 @@
               <w:color w:val="auto"/>
               <w:sz w:val="22"/>
             </w:rPr>
+            <w:t xml:space="preserve"> Qualtrics link (provided by email or shared in person) or, if preferred, a paper copy of the same questionnaire labeled only with the participant's site identification code</w:t>
+          </w:r>
+          <w:r>
+            <w:rPr>
+              <w:rFonts w:ascii="Arial" w:hAnsi="Arial" w:cs="Arial"/>
+              <w:color w:val="auto"/>
+              <w:sz w:val="22"/>
+            </w:rPr>
+            <w:t xml:space="preserve">. All </w:t>
+          </w:r>
+          <w:r>
+            <w:rPr>
+              <w:rFonts w:ascii="Arial" w:hAnsi="Arial" w:cs="Arial"/>
+              <w:color w:val="auto"/>
+              <w:sz w:val="22"/>
+            </w:rPr>
+            <w:t>field-study participants</w:t>
+          </w:r>
+          <w:r>
+            <w:rPr>
+              <w:rFonts w:ascii="Arial" w:hAnsi="Arial" w:cs="Arial"/>
+              <w:color w:val="auto"/>
+              <w:sz w:val="22"/>
+            </w:rPr>
+            <w:t xml:space="preserve"> are drawn from those already enrolled in the associated</w:t>
+          </w:r>
+          <w:r>
+            <w:rPr>
+              <w:rFonts w:ascii="Arial" w:hAnsi="Arial" w:cs="Arial"/>
+              <w:color w:val="auto"/>
+              <w:sz w:val="22"/>
+            </w:rPr>
             <w:t xml:space="preserve"> field-sampling project (Aims 1 and 2, reviewed under IACUC protocol IPROTO202500000090</w:t>
           </w:r>
           <w:r>
@@ -9143,6 +9561,43 @@
               <w:sz w:val="22"/>
             </w:rPr>
             <w:t>.</w:t>
+          </w:r>
+        </w:p>
+        <w:p>
+          <w:pPr>
+            <w:pStyle w:val="BlockText"/>
+            <w:pBdr>
+              <w:top w:val="none" w:sz="0" w:space="0" w:color="auto"/>
+              <w:left w:val="none" w:sz="0" w:space="0" w:color="auto"/>
+              <w:bottom w:val="none" w:sz="0" w:space="0" w:color="auto"/>
+              <w:right w:val="none" w:sz="0" w:space="0" w:color="auto"/>
+            </w:pBdr>
+            <w:autoSpaceDE/>
+            <w:autoSpaceDN/>
+            <w:adjustRightInd/>
+            <w:spacing w:before="120" w:after="120"/>
+            <w:ind w:left="720" w:right="720"/>
+            <w:rPr>
+              <w:rFonts w:ascii="Arial" w:hAnsi="Arial" w:cs="Arial"/>
+              <w:color w:val="auto"/>
+              <w:sz w:val="22"/>
+            </w:rPr>
+          </w:pPr>
+          <w:r>
+            <w:rPr>
+              <w:rFonts w:ascii="Arial" w:hAnsi="Arial" w:cs="Arial"/>
+              <w:color w:val="auto"/>
+              <w:sz w:val="22"/>
+            </w:rPr>
+            <w:t xml:space="preserve">General audience participants will be recruited via email or local newsletter, which will include a brief recruitment message (see Local Site Documents-Recruitment Materials). This message will be distributed </w:t>
+          </w:r>
+          <w:r>
+            <w:rPr>
+              <w:rFonts w:ascii="Arial" w:hAnsi="Arial" w:cs="Arial"/>
+              <w:color w:val="auto"/>
+              <w:sz w:val="22"/>
+            </w:rPr>
+            <w:t xml:space="preserve">during the same time window as the field-study survey and will use similar language. </w:t>
           </w:r>
         </w:p>
       </w:sdtContent>
@@ -9273,7 +9728,64 @@
               <w:color w:val="auto"/>
               <w:sz w:val="22"/>
             </w:rPr>
-            <w:t>Eligibility will be determined by a self-screening checklist presented at the start of the survey, before any study questions (see Local Site Documents–Other Attachments). On the first screen of the online survey (or the cover page of the paper version), prospective participants will confirm that they meet the eligibility criteria: that they are 18 years of age or older, are enrolled in the associated field-sampling project, and are participating voluntarily. This screen also states that, by clicking "Next" (or by completing the paper survey), the participant is confirming they meet the eligibility requirements and are voluntarily consenting to participate. Individuals who do not meet all criteria will not proceed to the survey questions. This self-screening approach is consistent with the confidential design of the study, as it establishes eligibility and consent without collecting directly identifying information.</w:t>
+            <w:t xml:space="preserve">Eligibility will be determined by a self-screening checklist presented at the start of the survey, before any study questions (see Local Site Documents–Other Attachments). On the </w:t>
+          </w:r>
+          <w:r>
+            <w:rPr>
+              <w:rFonts w:ascii="Arial" w:hAnsi="Arial" w:cs="Arial"/>
+              <w:color w:val="auto"/>
+              <w:sz w:val="22"/>
+            </w:rPr>
+            <w:t>opening</w:t>
+          </w:r>
+          <w:r>
+            <w:rPr>
+              <w:rFonts w:ascii="Arial" w:hAnsi="Arial" w:cs="Arial"/>
+              <w:color w:val="auto"/>
+              <w:sz w:val="22"/>
+            </w:rPr>
+            <w:t xml:space="preserve"> screen of the online survey (or the cover page of </w:t>
+          </w:r>
+          <w:r>
+            <w:rPr>
+              <w:rFonts w:ascii="Arial" w:hAnsi="Arial" w:cs="Arial"/>
+              <w:color w:val="auto"/>
+              <w:sz w:val="22"/>
+            </w:rPr>
+            <w:lastRenderedPageBreak/>
+            <w:t xml:space="preserve">the paper version), prospective participants will confirm that they meet the eligibility criteria: that they are 18 years of age or older, </w:t>
+          </w:r>
+          <w:r>
+            <w:rPr>
+              <w:rFonts w:ascii="Arial" w:hAnsi="Arial" w:cs="Arial"/>
+              <w:color w:val="auto"/>
+              <w:sz w:val="22"/>
+            </w:rPr>
+            <w:t>currently participate in relevant backyard activities or have knowledge and interest in them</w:t>
+          </w:r>
+          <w:r>
+            <w:rPr>
+              <w:rFonts w:ascii="Arial" w:hAnsi="Arial" w:cs="Arial"/>
+              <w:color w:val="auto"/>
+              <w:sz w:val="22"/>
+            </w:rPr>
+            <w:t>,</w:t>
+          </w:r>
+          <w:r>
+            <w:rPr>
+              <w:rFonts w:ascii="Arial" w:hAnsi="Arial" w:cs="Arial"/>
+              <w:color w:val="auto"/>
+              <w:sz w:val="22"/>
+            </w:rPr>
+            <w:t xml:space="preserve"> reside in the SE U.S.,</w:t>
+          </w:r>
+          <w:r>
+            <w:rPr>
+              <w:rFonts w:ascii="Arial" w:hAnsi="Arial" w:cs="Arial"/>
+              <w:color w:val="auto"/>
+              <w:sz w:val="22"/>
+            </w:rPr>
+            <w:t xml:space="preserve"> and are participating voluntarily. This screen also states that, by clicking "Next" (or by completing the paper survey), the participant is confirming they meet the eligibility requirements and are voluntarily consenting to participate. Individuals who do not meet all criteria will not proceed to the survey questions. This self-screening approach is consistent with the confidential design of the study, as it establishes eligibility and consent without collecting directly identifying information.</w:t>
           </w:r>
         </w:p>
       </w:sdtContent>
@@ -9344,16 +9856,7 @@
           <w:color w:val="auto"/>
           <w:sz w:val="22"/>
         </w:rPr>
-        <w:t xml:space="preserve">. For advertisements, attach the final copy of the printed advertisements (e.g., </w:t>
-      </w:r>
-      <w:r>
-        <w:rPr>
-          <w:rFonts w:ascii="Arial" w:hAnsi="Arial" w:cs="Arial"/>
-          <w:color w:val="auto"/>
-          <w:sz w:val="22"/>
-        </w:rPr>
-        <w:lastRenderedPageBreak/>
-        <w:t>flier, social media post). When advertisements are taped for broadcast, attach the final audio/video tape. You may submit the wording of the advertisement prior to taping to preclude re-taping because of inappropriate wording, provided the IRB reviews the final audio/video tape.</w:t>
+        <w:t>. For advertisements, attach the final copy of the printed advertisements (e.g., flier, social media post). When advertisements are taped for broadcast, attach the final audio/video tape. You may submit the wording of the advertisement prior to taping to preclude re-taping because of inappropriate wording, provided the IRB reviews the final audio/video tape.</w:t>
       </w:r>
     </w:p>
     <w:p>
@@ -9443,7 +9946,15 @@
               <w:color w:val="000000" w:themeColor="text1"/>
               <w:sz w:val="22"/>
             </w:rPr>
-            <w:t>One recruitment material will be used and is provided in Local Site Documents–Recruitment Materials: a recruitment script (Word document) used to invite already-enrolled homeowners to complete the survey. The same script is delivered verbally in person during a field visit or sent by email when an in-person visit is not possible. No flyer, printed advertisement, audio, or video advertisement will be used.</w:t>
+            <w:t>Two versions of the same recruitment script will be used and are provided in a Word document in Local-Site Documents-Recruitment Materials</w:t>
+          </w:r>
+          <w:r>
+            <w:rPr>
+              <w:rFonts w:ascii="Arial" w:hAnsi="Arial" w:cs="Arial"/>
+              <w:color w:val="000000" w:themeColor="text1"/>
+              <w:sz w:val="22"/>
+            </w:rPr>
+            <w:t>. No flyer, printed advertisement, audio, or video advertisement will be used.</w:t>
           </w:r>
         </w:p>
         <w:p>
@@ -9463,7 +9974,55 @@
               <w:color w:val="000000" w:themeColor="text1"/>
               <w:sz w:val="22"/>
             </w:rPr>
-            <w:t>The recruitment script is limited to the information prospective participants need to determine their eligibility and interest, consistent with HRP-315 – WORKSHEET – Advertisements. It identifies the investigators and their institution (Auburn University College of Forestry, Wildlife and Environment), states the purpose of the research, summarizes the eligibility criteria and time commitment (approximately 10–15 minutes), and provides contact information for questions. The script does not state or imply any certainty of favorable outcome or benefit beyond what is described in the protocol and Information Letter, does not emphasize payment (none is offered), and contains no exculpatory language.</w:t>
+            <w:t>The recruitment script</w:t>
+          </w:r>
+          <w:r>
+            <w:rPr>
+              <w:rFonts w:ascii="Arial" w:hAnsi="Arial" w:cs="Arial"/>
+              <w:color w:val="000000" w:themeColor="text1"/>
+              <w:sz w:val="22"/>
+            </w:rPr>
+            <w:t>s are</w:t>
+          </w:r>
+          <w:r>
+            <w:rPr>
+              <w:rFonts w:ascii="Arial" w:hAnsi="Arial" w:cs="Arial"/>
+              <w:color w:val="000000" w:themeColor="text1"/>
+              <w:sz w:val="22"/>
+            </w:rPr>
+            <w:t xml:space="preserve"> limited to the information prospective participants need to determine their eligibility and interest, consistent with HRP-315 – WORKSHEET – Advertisements. It identifies the investigators and their institution (Auburn University College of Forestry, Wildlife and Environment), states the purpose of the research, summarizes the eligibility criteria and time commitment (approximately 10–15 minutes), and provides contact information for questions. The </w:t>
+          </w:r>
+          <w:r>
+            <w:rPr>
+              <w:rFonts w:ascii="Arial" w:hAnsi="Arial" w:cs="Arial"/>
+              <w:color w:val="000000" w:themeColor="text1"/>
+              <w:sz w:val="22"/>
+            </w:rPr>
+            <w:t xml:space="preserve">scripts do </w:t>
+          </w:r>
+          <w:r>
+            <w:rPr>
+              <w:rFonts w:ascii="Arial" w:hAnsi="Arial" w:cs="Arial"/>
+              <w:color w:val="000000" w:themeColor="text1"/>
+              <w:sz w:val="22"/>
+            </w:rPr>
+            <w:t xml:space="preserve">not state or imply any certainty of favorable outcome or benefit beyond what is described in the protocol and Information Letter, </w:t>
+          </w:r>
+          <w:r>
+            <w:rPr>
+              <w:rFonts w:ascii="Arial" w:hAnsi="Arial" w:cs="Arial"/>
+              <w:color w:val="000000" w:themeColor="text1"/>
+              <w:sz w:val="22"/>
+            </w:rPr>
+            <w:t>emphasizes no payment is offered</w:t>
+          </w:r>
+          <w:r>
+            <w:rPr>
+              <w:rFonts w:ascii="Arial" w:hAnsi="Arial" w:cs="Arial"/>
+              <w:color w:val="000000" w:themeColor="text1"/>
+              <w:sz w:val="22"/>
+            </w:rPr>
+            <w:t>, and contains no exculpatory language.</w:t>
           </w:r>
         </w:p>
       </w:sdtContent>
@@ -9608,7 +10167,51 @@
               <w:color w:val="auto"/>
               <w:sz w:val="22"/>
             </w:rPr>
-            <w:t>Recruitment for the survey draws from the homeowners already enrolled in the associated field-sampling project, which currently includes approximately 13 households, all of whom completed the entry questionnaire at enrollment. Because these participants are already engaged with the project and familiar with its activities, recruitment is expected to be feasible within the planned window. Our aim is for all 13 enrolled households to complete the survey. If all enrolled households participate, we anticipate approximately 13 respondents; at participation rates of 80%, 50%, or 20%, we expect roughly 10, 6, or 3 respondents, respectively. Aligning with the novel and exploratory nature of this research, even a small number of responses will provide valuable insight into the human dimensions of backyard disease risk.</w:t>
+            <w:t xml:space="preserve">Recruitment for the survey draws from the homeowners already enrolled in the associated field-sampling project, which currently includes approximately 13 households, all of whom completed the entry questionnaire at enrollment. Because these participants are already engaged with the project and familiar with its activities, recruitment is expected to be feasible within the planned window. Our aim is for all 13 enrolled households to complete the survey. If all enrolled households participate, we anticipate approximately 13 respondents; at participation rates of 80%, 50%, or 20%, we expect roughly 10, 6, or 3 </w:t>
+          </w:r>
+          <w:r>
+            <w:rPr>
+              <w:rFonts w:ascii="Arial" w:hAnsi="Arial" w:cs="Arial"/>
+              <w:i w:val="0"/>
+              <w:iCs w:val="0"/>
+              <w:color w:val="auto"/>
+              <w:sz w:val="22"/>
+            </w:rPr>
+            <w:lastRenderedPageBreak/>
+            <w:t>respondents, respectively. Aligning with the novel and exploratory nature of this research, even a small number of responses will provide valuable insight into the human dimensions of backyard disease risk.</w:t>
+          </w:r>
+        </w:p>
+        <w:p>
+          <w:pPr>
+            <w:pStyle w:val="BlockText"/>
+            <w:pBdr>
+              <w:top w:val="none" w:sz="0" w:space="0" w:color="auto"/>
+              <w:left w:val="none" w:sz="0" w:space="0" w:color="auto"/>
+              <w:bottom w:val="none" w:sz="0" w:space="0" w:color="auto"/>
+              <w:right w:val="none" w:sz="0" w:space="0" w:color="auto"/>
+            </w:pBdr>
+            <w:autoSpaceDE/>
+            <w:autoSpaceDN/>
+            <w:adjustRightInd/>
+            <w:spacing w:before="120" w:after="120"/>
+            <w:ind w:left="720" w:right="720"/>
+            <w:rPr>
+              <w:rFonts w:ascii="Arial" w:hAnsi="Arial" w:cs="Arial"/>
+              <w:i w:val="0"/>
+              <w:iCs w:val="0"/>
+              <w:color w:val="auto"/>
+              <w:sz w:val="22"/>
+            </w:rPr>
+          </w:pPr>
+          <w:r>
+            <w:rPr>
+              <w:rFonts w:ascii="Arial" w:hAnsi="Arial" w:cs="Arial"/>
+              <w:i w:val="0"/>
+              <w:iCs w:val="0"/>
+              <w:color w:val="auto"/>
+              <w:sz w:val="22"/>
+            </w:rPr>
+            <w:t xml:space="preserve">Because the general-audience participants self-select, the number of respondents cannot be set in advance; at a response rate of 33% we would expect an approximate 50 additional respondents. Recruitment through an established audience is expected to be feasible within the planned window. </w:t>
           </w:r>
         </w:p>
       </w:sdtContent>
@@ -9812,34 +10415,34 @@
           <w:rFonts w:ascii="Arial" w:hAnsi="Arial" w:cs="Arial"/>
         </w:rPr>
       </w:pPr>
-      <w:bookmarkStart w:id="23" w:name="_Toc492992334"/>
-      <w:bookmarkStart w:id="24" w:name="_Toc492992602"/>
-      <w:bookmarkStart w:id="25" w:name="_Toc493022872"/>
-      <w:bookmarkStart w:id="26" w:name="_Toc492992335"/>
-      <w:bookmarkStart w:id="27" w:name="_Toc492992603"/>
-      <w:bookmarkStart w:id="28" w:name="_Toc493022873"/>
-      <w:bookmarkStart w:id="29" w:name="_Toc492992336"/>
-      <w:bookmarkStart w:id="30" w:name="_Toc492992604"/>
-      <w:bookmarkStart w:id="31" w:name="_Toc493022874"/>
-      <w:bookmarkStart w:id="32" w:name="_Toc226630102"/>
-      <w:bookmarkEnd w:id="23"/>
-      <w:bookmarkEnd w:id="24"/>
-      <w:bookmarkEnd w:id="25"/>
-      <w:bookmarkEnd w:id="26"/>
-      <w:bookmarkEnd w:id="27"/>
+      <w:bookmarkStart w:id="28" w:name="_Toc492992334"/>
+      <w:bookmarkStart w:id="29" w:name="_Toc492992602"/>
+      <w:bookmarkStart w:id="30" w:name="_Toc493022872"/>
+      <w:bookmarkStart w:id="31" w:name="_Toc492992335"/>
+      <w:bookmarkStart w:id="32" w:name="_Toc492992603"/>
+      <w:bookmarkStart w:id="33" w:name="_Toc493022873"/>
+      <w:bookmarkStart w:id="34" w:name="_Toc492992336"/>
+      <w:bookmarkStart w:id="35" w:name="_Toc492992604"/>
+      <w:bookmarkStart w:id="36" w:name="_Toc493022874"/>
+      <w:bookmarkStart w:id="37" w:name="_Toc226630102"/>
       <w:bookmarkEnd w:id="28"/>
       <w:bookmarkEnd w:id="29"/>
       <w:bookmarkEnd w:id="30"/>
       <w:bookmarkEnd w:id="31"/>
+      <w:bookmarkEnd w:id="32"/>
+      <w:bookmarkEnd w:id="33"/>
+      <w:bookmarkEnd w:id="34"/>
+      <w:bookmarkEnd w:id="35"/>
+      <w:bookmarkEnd w:id="36"/>
       <w:r>
         <w:rPr>
           <w:rFonts w:ascii="Arial" w:hAnsi="Arial" w:cs="Arial"/>
         </w:rPr>
         <w:t>Withdrawal of Participants</w:t>
       </w:r>
-      <w:bookmarkEnd w:id="32"/>
-    </w:p>
-    <w:bookmarkStart w:id="33" w:name="_Hlk202455930"/>
+      <w:bookmarkEnd w:id="37"/>
+    </w:p>
+    <w:bookmarkStart w:id="38" w:name="_Hlk202455930"/>
     <w:p>
       <w:pPr>
         <w:pStyle w:val="List"/>
@@ -9892,7 +10495,7 @@
         <w:t xml:space="preserve"> Select if section 15.0 is not applicable to your research project because withdrawal of subjects without their consent is not anticipated, all data collected are de-identified/anonymous, or the study is limited to the analysis of pre-existing data. </w:t>
       </w:r>
     </w:p>
-    <w:bookmarkEnd w:id="33"/>
+    <w:bookmarkEnd w:id="38"/>
     <w:p>
       <w:pPr>
         <w:pStyle w:val="BlockText"/>
@@ -10077,6 +10680,16 @@
           </w:r>
         </w:sdtContent>
       </w:sdt>
+      <w:r>
+        <w:rPr>
+          <w:rFonts w:ascii="Arial" w:hAnsi="Arial" w:cs="Arial"/>
+          <w:i w:val="0"/>
+          <w:iCs w:val="0"/>
+          <w:color w:val="auto"/>
+          <w:sz w:val="22"/>
+        </w:rPr>
+        <w:t xml:space="preserve"> Responses from general audience participants are anonymous and cannot be withdrawn. </w:t>
+      </w:r>
     </w:p>
     <w:p>
       <w:pPr>
@@ -10108,14 +10721,15 @@
           <w:rFonts w:ascii="Arial" w:hAnsi="Arial" w:cs="Arial"/>
         </w:rPr>
       </w:pPr>
-      <w:bookmarkStart w:id="34" w:name="_Toc226630103"/>
-      <w:r>
-        <w:rPr>
-          <w:rFonts w:ascii="Arial" w:hAnsi="Arial" w:cs="Arial"/>
-        </w:rPr>
+      <w:bookmarkStart w:id="39" w:name="_Toc226630103"/>
+      <w:r>
+        <w:rPr>
+          <w:rFonts w:ascii="Arial" w:hAnsi="Arial" w:cs="Arial"/>
+        </w:rPr>
+        <w:lastRenderedPageBreak/>
         <w:t>Risks to Participants and Procedures to Minimize Risk</w:t>
       </w:r>
-      <w:bookmarkEnd w:id="34"/>
+      <w:bookmarkEnd w:id="39"/>
     </w:p>
     <w:p>
       <w:pPr>
@@ -10224,7 +10838,6 @@
           <w:color w:val="auto"/>
           <w:sz w:val="22"/>
         </w:rPr>
-        <w:lastRenderedPageBreak/>
         <w:t>If applicable, indicate which procedures may have risks to the Participants that are currently unforeseeable due to the use of novel or untested research procedures or test articles.</w:t>
       </w:r>
     </w:p>
@@ -10880,7 +11493,15 @@
           <w:rFonts w:ascii="Arial" w:hAnsi="Arial" w:cs="Arial"/>
           <w:sz w:val="22"/>
         </w:rPr>
-        <w:t>The plan to periodically evaluate the data collected regarding both harms and benefits to determine whether Participants remain safe.  The plan might include establishing a data monitoring committee and a plan for reporting data monitoring committee findings to the IRB and the sponsor.</w:t>
+        <w:t xml:space="preserve">The plan to periodically evaluate the data collected regarding both harms and benefits to determine whether Participants remain safe.  The plan might include establishing a data monitoring committee and </w:t>
+      </w:r>
+      <w:r>
+        <w:rPr>
+          <w:rFonts w:ascii="Arial" w:hAnsi="Arial" w:cs="Arial"/>
+          <w:sz w:val="22"/>
+        </w:rPr>
+        <w:lastRenderedPageBreak/>
+        <w:t>a plan for reporting data monitoring committee findings to the IRB and the sponsor.</w:t>
       </w:r>
     </w:p>
     <w:p>
@@ -11116,14 +11737,14 @@
           <w:rFonts w:ascii="Arial" w:hAnsi="Arial" w:cs="Arial"/>
         </w:rPr>
       </w:pPr>
-      <w:bookmarkStart w:id="35" w:name="_Toc226630104"/>
+      <w:bookmarkStart w:id="40" w:name="_Toc226630104"/>
       <w:r>
         <w:rPr>
           <w:rFonts w:ascii="Arial" w:hAnsi="Arial" w:cs="Arial"/>
         </w:rPr>
         <w:t>Provisions to Protect the Privacy Interests of Participants</w:t>
       </w:r>
-      <w:bookmarkEnd w:id="35"/>
+      <w:bookmarkEnd w:id="40"/>
     </w:p>
     <w:p>
       <w:pPr>
@@ -11155,7 +11776,6 @@
           <w:color w:val="auto"/>
           <w:sz w:val="22"/>
         </w:rPr>
-        <w:lastRenderedPageBreak/>
         <w:t>Describe the steps that will be taken to protect Participants’ privacy interests. “Privacy interest” refers to a person’s desire to place limits on whom they interact or whom they provide personal information.</w:t>
       </w:r>
     </w:p>
@@ -11198,7 +11818,39 @@
               <w:color w:val="auto"/>
               <w:sz w:val="22"/>
             </w:rPr>
-            <w:t>Steps will be taken to protect participants' privacy interests throughout the study. Participation is voluntary, and participants may skip any question they prefer not to answer or discontinue at any time. The survey collects no directly identifying information such as name, email address, or precise location; responses are labeled only with a site code, and the list linking codes to households is stored separately and securely (see Section 19.0). Because the survey is self-administered at a time and location of the participant's own choosing, participants may complete it privately and are not observed by the research team. All findings will be reported in aggregate.</w:t>
+            <w:t xml:space="preserve">Steps will be taken to protect participants' privacy interests throughout the study. Participation is voluntary, and participants may skip any question they prefer not to answer or discontinue at any time. The survey collects no directly identifying information such as name, email address, or precise location; </w:t>
+          </w:r>
+          <w:r>
+            <w:rPr>
+              <w:rFonts w:ascii="Arial" w:hAnsi="Arial" w:cs="Arial"/>
+              <w:color w:val="auto"/>
+              <w:sz w:val="22"/>
+            </w:rPr>
+            <w:t xml:space="preserve">field-study participant </w:t>
+          </w:r>
+          <w:r>
+            <w:rPr>
+              <w:rFonts w:ascii="Arial" w:hAnsi="Arial" w:cs="Arial"/>
+              <w:color w:val="auto"/>
+              <w:sz w:val="22"/>
+            </w:rPr>
+            <w:t>responses are labeled only with a site code, and the list linking codes to households is stored separately and securely (see Section 19.0)</w:t>
+          </w:r>
+          <w:r>
+            <w:rPr>
+              <w:rFonts w:ascii="Arial" w:hAnsi="Arial" w:cs="Arial"/>
+              <w:color w:val="auto"/>
+              <w:sz w:val="22"/>
+            </w:rPr>
+            <w:t>, while general-audience participant responses carry no site linkage and are anonymous</w:t>
+          </w:r>
+          <w:r>
+            <w:rPr>
+              <w:rFonts w:ascii="Arial" w:hAnsi="Arial" w:cs="Arial"/>
+              <w:color w:val="auto"/>
+              <w:sz w:val="22"/>
+            </w:rPr>
+            <w:t>. Because the survey is self-administered at a time and location of the participant's own choosing, participants may complete it privately and are not observed by the research team. All findings will be reported in aggregate.</w:t>
           </w:r>
         </w:p>
       </w:sdtContent>
@@ -11489,14 +12141,14 @@
           <w:rFonts w:ascii="Arial" w:hAnsi="Arial" w:cs="Arial"/>
         </w:rPr>
       </w:pPr>
-      <w:bookmarkStart w:id="36" w:name="_Toc226630105"/>
+      <w:bookmarkStart w:id="41" w:name="_Toc226630105"/>
       <w:r>
         <w:rPr>
           <w:rFonts w:ascii="Arial" w:hAnsi="Arial" w:cs="Arial"/>
         </w:rPr>
         <w:t>Potential Benefits to Participants</w:t>
       </w:r>
-      <w:bookmarkEnd w:id="36"/>
+      <w:bookmarkEnd w:id="41"/>
     </w:p>
     <w:p>
       <w:pPr>
@@ -11639,20 +12291,20 @@
           <w:rFonts w:ascii="Arial" w:hAnsi="Arial" w:cs="Arial"/>
         </w:rPr>
       </w:pPr>
-      <w:bookmarkStart w:id="37" w:name="_Toc202779696"/>
-      <w:bookmarkStart w:id="38" w:name="_Toc202780046"/>
-      <w:bookmarkStart w:id="39" w:name="_Toc202780110"/>
-      <w:bookmarkStart w:id="40" w:name="_Toc226630106"/>
-      <w:bookmarkEnd w:id="37"/>
-      <w:bookmarkEnd w:id="38"/>
-      <w:bookmarkEnd w:id="39"/>
+      <w:bookmarkStart w:id="42" w:name="_Toc202779696"/>
+      <w:bookmarkStart w:id="43" w:name="_Toc202780046"/>
+      <w:bookmarkStart w:id="44" w:name="_Toc202780110"/>
+      <w:bookmarkStart w:id="45" w:name="_Toc226630106"/>
+      <w:bookmarkEnd w:id="42"/>
+      <w:bookmarkEnd w:id="43"/>
+      <w:bookmarkEnd w:id="44"/>
       <w:r>
         <w:rPr>
           <w:rFonts w:ascii="Arial" w:hAnsi="Arial" w:cs="Arial"/>
         </w:rPr>
         <w:t>Data Management and Confidentiality</w:t>
       </w:r>
-      <w:bookmarkEnd w:id="40"/>
+      <w:bookmarkEnd w:id="45"/>
     </w:p>
     <w:p>
       <w:pPr>
@@ -11728,6 +12380,22 @@
             </w:rPr>
             <w:t>Survey data will be analyzed using both descriptive and inferential statistics. Descriptive statistics (e.g., frequencies, percentages, means, and standard deviations) will be used to summarize participant characteristics and responses across the main survey concepts, including motivations, place attachment, disease-risk perception, biosecurity practices, and pro-conservation attitudes and behaviors. Inferential statistics will then be used to examine relationships among these variables. For example, correlation analyses, chi-square tests of association, or regression models to assess whether factors such as disease-risk perception or zoonotic disease knowledge are associated with reported biosecurity practices or willingness to modify backyard behaviors. Given the novel and exploratory nature of this research and the anticipated sample size, analyses will emphasize describing patterns and generating hypotheses rather than confirmatory hypothesis testing. All analyses will be conducted using standard statistical software.</w:t>
           </w:r>
+          <w:r>
+            <w:rPr>
+              <w:rFonts w:ascii="Arial" w:hAnsi="Arial" w:cs="Arial"/>
+              <w:color w:val="auto"/>
+              <w:sz w:val="22"/>
+            </w:rPr>
+            <w:t xml:space="preserve"> Analyses that link survey responses to disease data from Aims 1 &amp; 2 will be limited to coded responses</w:t>
+          </w:r>
+          <w:r>
+            <w:rPr>
+              <w:rFonts w:ascii="Arial" w:hAnsi="Arial" w:cs="Arial"/>
+              <w:color w:val="auto"/>
+              <w:sz w:val="22"/>
+            </w:rPr>
+            <w:t xml:space="preserve"> from field-study participants, and responses from general-audience participants will be included in all other analyses; the two groups’ responses may be compared descriptively. </w:t>
+          </w:r>
         </w:p>
       </w:sdtContent>
     </w:sdt>
@@ -11840,7 +12508,38 @@
               <w:color w:val="000000" w:themeColor="text1"/>
               <w:sz w:val="22"/>
             </w:rPr>
-            <w:t>The survey collects no directly identifying information; responses are labeled with a site identification code that links them to the biological and environmental data collected through Aims 1 and 2. The list linking site codes to households is stored in a separate, password-protected folder kept apart from the survey data. Any file containing participant names or contact information is to be maintained for the logistical purpose of scheduling field visits under the associated field-sampling project, and will be stored in a separate, password-protected folder, kept apart from the folders containing survey data. This separation ensures that participant identities cannot be associated with individual survey responses.</w:t>
+            <w:lastRenderedPageBreak/>
+            <w:t xml:space="preserve">The survey collects no directly identifying information; </w:t>
+          </w:r>
+          <w:r>
+            <w:rPr>
+              <w:rFonts w:ascii="Arial" w:hAnsi="Arial" w:cs="Arial"/>
+              <w:i w:val="0"/>
+              <w:iCs w:val="0"/>
+              <w:color w:val="000000" w:themeColor="text1"/>
+              <w:sz w:val="22"/>
+            </w:rPr>
+            <w:t xml:space="preserve">field-study participant </w:t>
+          </w:r>
+          <w:r>
+            <w:rPr>
+              <w:rFonts w:ascii="Arial" w:hAnsi="Arial" w:cs="Arial"/>
+              <w:i w:val="0"/>
+              <w:iCs w:val="0"/>
+              <w:color w:val="000000" w:themeColor="text1"/>
+              <w:sz w:val="22"/>
+            </w:rPr>
+            <w:t>responses are labeled with a site identification code that links them to the biological and environmental data collected through Aims 1 and 2. The list linking site codes to households is stored in a separate, password-protected folder kept apart from the survey data. Any file containing participant names or contact information is to be maintained for the logistical purpose of scheduling field visits under the associated field-sampling project, and will be stored in a separate, password-protected folder, kept apart from the folders containing survey data. This separation ensures that participant identities cannot be associated with individual survey responses.</w:t>
+          </w:r>
+          <w:r>
+            <w:rPr>
+              <w:rFonts w:ascii="Arial" w:hAnsi="Arial" w:cs="Arial"/>
+              <w:i w:val="0"/>
+              <w:iCs w:val="0"/>
+              <w:color w:val="000000" w:themeColor="text1"/>
+              <w:sz w:val="22"/>
+            </w:rPr>
+            <w:t xml:space="preserve"> Responses from general-audience participants will be anonymized so that IP addresses and location data are not recorded. No names or email addresses will be stored from Qualtrics. </w:t>
           </w:r>
         </w:p>
         <w:p>
@@ -12031,7 +12730,6 @@
           <w:color w:val="auto"/>
           <w:sz w:val="22"/>
         </w:rPr>
-        <w:lastRenderedPageBreak/>
         <w:t>Describe how data or specimens will be handled study-wide:</w:t>
       </w:r>
     </w:p>
@@ -12513,14 +13211,14 @@
           <w:rFonts w:ascii="Arial" w:hAnsi="Arial" w:cs="Arial"/>
         </w:rPr>
       </w:pPr>
-      <w:bookmarkStart w:id="41" w:name="_Toc226630107"/>
+      <w:bookmarkStart w:id="46" w:name="_Toc226630107"/>
       <w:r>
         <w:rPr>
           <w:rFonts w:ascii="Arial" w:hAnsi="Arial" w:cs="Arial"/>
         </w:rPr>
         <w:t>Compensation for Research-Related Injury</w:t>
       </w:r>
-      <w:bookmarkEnd w:id="41"/>
+      <w:bookmarkEnd w:id="46"/>
     </w:p>
     <w:p>
       <w:pPr>
@@ -12794,14 +13492,14 @@
           <w:rFonts w:ascii="Arial" w:hAnsi="Arial" w:cs="Arial"/>
         </w:rPr>
       </w:pPr>
-      <w:bookmarkStart w:id="42" w:name="_Toc226630108"/>
+      <w:bookmarkStart w:id="47" w:name="_Toc226630108"/>
       <w:r>
         <w:rPr>
           <w:rFonts w:ascii="Arial" w:hAnsi="Arial" w:cs="Arial"/>
         </w:rPr>
         <w:t>Economic Burden to Participants</w:t>
       </w:r>
-      <w:bookmarkEnd w:id="42"/>
+      <w:bookmarkEnd w:id="47"/>
     </w:p>
     <w:p>
       <w:pPr>
@@ -12968,7 +13666,7 @@
           <w:rFonts w:ascii="Arial" w:hAnsi="Arial" w:cs="Arial"/>
         </w:rPr>
       </w:pPr>
-      <w:bookmarkStart w:id="43" w:name="_Toc226630109"/>
+      <w:bookmarkStart w:id="48" w:name="_Toc226630109"/>
       <w:r>
         <w:rPr>
           <w:rFonts w:ascii="Arial" w:hAnsi="Arial" w:cs="Arial"/>
@@ -12992,7 +13690,7 @@
         </w:rPr>
         <w:t xml:space="preserve"> within Endeavor)</w:t>
       </w:r>
-      <w:bookmarkEnd w:id="43"/>
+      <w:bookmarkEnd w:id="48"/>
     </w:p>
     <w:p>
       <w:pPr>
@@ -13303,6 +14001,7 @@
           <w:rFonts w:ascii="Arial" w:hAnsi="Arial" w:cs="Arial"/>
           <w:sz w:val="22"/>
         </w:rPr>
+        <w:lastRenderedPageBreak/>
         <w:t>Clearly communicates the intended use of AI technology and any unique risks.</w:t>
       </w:r>
     </w:p>
@@ -13682,7 +14381,6 @@
           <w:sz w:val="28"/>
           <w:szCs w:val="28"/>
         </w:rPr>
-        <w:lastRenderedPageBreak/>
         <w:t>Waiver or Alteration of Consent Process (consent will not be obtained, required information will not be disclosed, or the research involves deception)</w:t>
       </w:r>
     </w:p>
@@ -13937,7 +14635,15 @@
           <w:rFonts w:ascii="Arial" w:hAnsi="Arial" w:cs="Arial"/>
           <w:sz w:val="22"/>
         </w:rPr>
-        <w:t>Describe the criteria that will be used to determine whether a prospective Participant has not attained the legal age for consent to treatments or procedures involved in the research under the applicable law of the jurisdiction in which the research will be conducted. (E.g., individuals under the age of 18 years.)</w:t>
+        <w:t xml:space="preserve">Describe the criteria that will be used to determine whether a prospective Participant has not attained the legal age for consent to treatments or procedures involved in the research under the </w:t>
+      </w:r>
+      <w:r>
+        <w:rPr>
+          <w:rFonts w:ascii="Arial" w:hAnsi="Arial" w:cs="Arial"/>
+          <w:sz w:val="22"/>
+        </w:rPr>
+        <w:lastRenderedPageBreak/>
+        <w:t>applicable law of the jurisdiction in which the research will be conducted. (E.g., individuals under the age of 18 years.)</w:t>
       </w:r>
     </w:p>
     <w:p>
@@ -14132,7 +14838,6 @@
           <w:rFonts w:ascii="Arial" w:hAnsi="Arial" w:cs="Arial"/>
           <w:sz w:val="22"/>
         </w:rPr>
-        <w:lastRenderedPageBreak/>
         <w:t>Indicate whether assent will be obtained from all, some, or none of the children. If assent will be obtained from some children, indicate which children will be required to assent.</w:t>
       </w:r>
     </w:p>
@@ -14430,6 +15135,7 @@
           <w:rFonts w:ascii="Arial" w:hAnsi="Arial" w:cs="Arial"/>
           <w:sz w:val="22"/>
         </w:rPr>
+        <w:lastRenderedPageBreak/>
         <w:t>List the individuals from whom permission will be obtained in order of priority. (E.g., durable power of attorney for health care, court appointed guardian for health care decisions, spouse, and adult child.)</w:t>
       </w:r>
     </w:p>
@@ -14617,15 +15323,7 @@
           <w:rFonts w:ascii="Arial" w:hAnsi="Arial" w:cs="Arial"/>
           <w:sz w:val="22"/>
         </w:rPr>
-        <w:t xml:space="preserve">Describe whether assent of the Participants will be documented and the process to document assent. The IRB allows the person obtaining assent to document assent on the consent document </w:t>
-      </w:r>
-      <w:r>
-        <w:rPr>
-          <w:rFonts w:ascii="Arial" w:hAnsi="Arial" w:cs="Arial"/>
-          <w:sz w:val="22"/>
-        </w:rPr>
-        <w:lastRenderedPageBreak/>
-        <w:t>and does not routinely require assent documents and does not routinely require Participants to sign assent documents.</w:t>
+        <w:t>Describe whether assent of the Participants will be documented and the process to document assent. The IRB allows the person obtaining assent to document assent on the consent document and does not routinely require assent documents and does not routinely require Participants to sign assent documents.</w:t>
       </w:r>
     </w:p>
     <w:p>
@@ -14732,14 +15430,14 @@
           <w:rFonts w:ascii="Arial" w:hAnsi="Arial" w:cs="Arial"/>
         </w:rPr>
       </w:pPr>
-      <w:bookmarkStart w:id="44" w:name="_Toc226630110"/>
+      <w:bookmarkStart w:id="49" w:name="_Toc226630110"/>
       <w:r>
         <w:rPr>
           <w:rFonts w:ascii="Arial" w:hAnsi="Arial" w:cs="Arial"/>
         </w:rPr>
         <w:t>Process to Document Consent in Writing</w:t>
       </w:r>
-      <w:bookmarkEnd w:id="44"/>
+      <w:bookmarkEnd w:id="49"/>
     </w:p>
     <w:p>
       <w:pPr>
@@ -15005,14 +15703,14 @@
           <w:rFonts w:ascii="Arial" w:hAnsi="Arial" w:cs="Arial"/>
         </w:rPr>
       </w:pPr>
-      <w:bookmarkStart w:id="45" w:name="_Toc226630111"/>
+      <w:bookmarkStart w:id="50" w:name="_Toc226630111"/>
       <w:r>
         <w:rPr>
           <w:rFonts w:ascii="Arial" w:hAnsi="Arial" w:cs="Arial"/>
         </w:rPr>
         <w:t>Multi-Site Research</w:t>
       </w:r>
-      <w:bookmarkEnd w:id="45"/>
+      <w:bookmarkEnd w:id="50"/>
       <w:r>
         <w:rPr>
           <w:rFonts w:ascii="Arial" w:hAnsi="Arial" w:cs="Arial"/>
@@ -15395,7 +16093,16 @@
             <w:rFonts w:ascii="Arial" w:hAnsi="Arial" w:cs="Arial"/>
             <w:sz w:val="22"/>
           </w:rPr>
-          <w:t>HRP-830 - WORKSHEET - Communication and Responsibilities</w:t>
+          <w:t xml:space="preserve">HRP-830 - </w:t>
+        </w:r>
+        <w:r>
+          <w:rPr>
+            <w:rStyle w:val="Hyperlink"/>
+            <w:rFonts w:ascii="Arial" w:hAnsi="Arial" w:cs="Arial"/>
+            <w:sz w:val="22"/>
+          </w:rPr>
+          <w:lastRenderedPageBreak/>
+          <w:t>WORKSHEET - Communication and Responsibilities</w:t>
         </w:r>
       </w:hyperlink>
       <w:r>
@@ -15886,6 +16593,95 @@
 <file path=word/numbering.xml><?xml version="1.0" encoding="utf-8"?>
 <w:numbering xmlns:wpc="http://schemas.microsoft.com/office/word/2010/wordprocessingCanvas" xmlns:cx="http://schemas.microsoft.com/office/drawing/2014/chartex" xmlns:cx1="http://schemas.microsoft.com/office/drawing/2015/9/8/chartex" xmlns:cx2="http://schemas.microsoft.com/office/drawing/2015/10/21/chartex" xmlns:cx3="http://schemas.microsoft.com/office/drawing/2016/5/9/chartex" xmlns:cx4="http://schemas.microsoft.com/office/drawing/2016/5/10/chartex" xmlns:cx5="http://schemas.microsoft.com/office/drawing/2016/5/11/chartex" xmlns:cx6="http://schemas.microsoft.com/office/drawing/2016/5/12/chartex" xmlns:cx7="http://schemas.microsoft.com/office/drawing/2016/5/13/chartex" xmlns:cx8="http://schemas.microsoft.com/office/drawing/2016/5/14/chartex" xmlns:mc="http://schemas.openxmlformats.org/markup-compatibility/2006" xmlns:m="http://schemas.openxmlformats.org/officeDocument/2006/math" xmlns:aink="http://schemas.microsoft.com/office/drawing/2016/ink" xmlns:am3d="http://schemas.microsoft.com/office/drawing/2017/model3d" xmlns:oel="http://schemas.microsoft.com/office/2019/extlst" xmlns:r="http://schemas.openxmlformats.org/officeDocument/2006/relationships" xmlns:wp14="http://schemas.microsoft.com/office/word/2010/wordprocessingDrawing" xmlns:wp="http://schemas.openxmlformats.org/drawingml/2006/wordprocessingDrawing" xmlns:wpg="http://schemas.microsoft.com/office/word/2010/wordprocessingGroup" xmlns:wpi="http://schemas.microsoft.com/office/word/2010/wordprocessingInk" xmlns:wps="http://schemas.microsoft.com/office/word/2010/wordprocessingShape" xmlns:o="urn:schemas-microsoft-com:office:office" xmlns:v="urn:schemas-microsoft-com:vml" xmlns:w10="urn:schemas-microsoft-com:office:word" xmlns:w="http://schemas.openxmlformats.org/wordprocessingml/2006/main" xmlns:w14="http://schemas.microsoft.com/office/word/2010/wordml" xmlns:w15="http://schemas.microsoft.com/office/word/2012/wordml" xmlns:w16cex="http://schemas.microsoft.com/office/word/2018/wordml/cex" xmlns:w16cid="http://schemas.microsoft.com/office/word/2016/wordml/cid" xmlns:w16="http://schemas.microsoft.com/office/word/2018/wordml" xmlns:w16sdtdh="http://schemas.microsoft.com/office/word/2020/wordml/sdtdatahash" xmlns:w16sdtfl="http://schemas.microsoft.com/office/word/2024/wordml/sdtformatlock" xmlns:w16se="http://schemas.microsoft.com/office/word/2015/wordml/symex" xmlns:w16du="http://schemas.microsoft.com/office/word/2023/wordml/word16du" xmlns:wne="http://schemas.microsoft.com/office/word/2006/wordml" mc:Ignorable="w14 w15 w16se w16cid w16 w16cex w16sdtdh w16sdtfl w16du wp14">
   <w:abstractNum w:abstractNumId="0" w15:restartNumberingAfterBreak="0">
+    <w:nsid w:val="00AD226E"/>
+    <w:multiLevelType w:val="hybridMultilevel"/>
+    <w:tmpl w:val="7422CC26"/>
+    <w:lvl w:ilvl="0" w:tplc="82A8EEDE">
+      <w:start w:val="1"/>
+      <w:numFmt w:val="decimal"/>
+      <w:lvlText w:val="(%1)"/>
+      <w:lvlJc w:val="left"/>
+      <w:pPr>
+        <w:ind w:left="1080" w:hanging="360"/>
+      </w:pPr>
+      <w:rPr>
+        <w:rFonts w:hint="default"/>
+      </w:rPr>
+    </w:lvl>
+    <w:lvl w:ilvl="1" w:tplc="04090019" w:tentative="1">
+      <w:start w:val="1"/>
+      <w:numFmt w:val="lowerLetter"/>
+      <w:lvlText w:val="%2."/>
+      <w:lvlJc w:val="left"/>
+      <w:pPr>
+        <w:ind w:left="1800" w:hanging="360"/>
+      </w:pPr>
+    </w:lvl>
+    <w:lvl w:ilvl="2" w:tplc="0409001B" w:tentative="1">
+      <w:start w:val="1"/>
+      <w:numFmt w:val="lowerRoman"/>
+      <w:lvlText w:val="%3."/>
+      <w:lvlJc w:val="right"/>
+      <w:pPr>
+        <w:ind w:left="2520" w:hanging="180"/>
+      </w:pPr>
+    </w:lvl>
+    <w:lvl w:ilvl="3" w:tplc="0409000F" w:tentative="1">
+      <w:start w:val="1"/>
+      <w:numFmt w:val="decimal"/>
+      <w:lvlText w:val="%4."/>
+      <w:lvlJc w:val="left"/>
+      <w:pPr>
+        <w:ind w:left="3240" w:hanging="360"/>
+      </w:pPr>
+    </w:lvl>
+    <w:lvl w:ilvl="4" w:tplc="04090019" w:tentative="1">
+      <w:start w:val="1"/>
+      <w:numFmt w:val="lowerLetter"/>
+      <w:lvlText w:val="%5."/>
+      <w:lvlJc w:val="left"/>
+      <w:pPr>
+        <w:ind w:left="3960" w:hanging="360"/>
+      </w:pPr>
+    </w:lvl>
+    <w:lvl w:ilvl="5" w:tplc="0409001B" w:tentative="1">
+      <w:start w:val="1"/>
+      <w:numFmt w:val="lowerRoman"/>
+      <w:lvlText w:val="%6."/>
+      <w:lvlJc w:val="right"/>
+      <w:pPr>
+        <w:ind w:left="4680" w:hanging="180"/>
+      </w:pPr>
+    </w:lvl>
+    <w:lvl w:ilvl="6" w:tplc="0409000F" w:tentative="1">
+      <w:start w:val="1"/>
+      <w:numFmt w:val="decimal"/>
+      <w:lvlText w:val="%7."/>
+      <w:lvlJc w:val="left"/>
+      <w:pPr>
+        <w:ind w:left="5400" w:hanging="360"/>
+      </w:pPr>
+    </w:lvl>
+    <w:lvl w:ilvl="7" w:tplc="04090019" w:tentative="1">
+      <w:start w:val="1"/>
+      <w:numFmt w:val="lowerLetter"/>
+      <w:lvlText w:val="%8."/>
+      <w:lvlJc w:val="left"/>
+      <w:pPr>
+        <w:ind w:left="6120" w:hanging="360"/>
+      </w:pPr>
+    </w:lvl>
+    <w:lvl w:ilvl="8" w:tplc="0409001B" w:tentative="1">
+      <w:start w:val="1"/>
+      <w:numFmt w:val="lowerRoman"/>
+      <w:lvlText w:val="%9."/>
+      <w:lvlJc w:val="right"/>
+      <w:pPr>
+        <w:ind w:left="6840" w:hanging="180"/>
+      </w:pPr>
+    </w:lvl>
+  </w:abstractNum>
+  <w:abstractNum w:abstractNumId="1" w15:restartNumberingAfterBreak="0">
     <w:nsid w:val="232046CF"/>
     <w:multiLevelType w:val="hybridMultilevel"/>
     <w:tmpl w:val="7280340E"/>
@@ -15998,7 +16794,7 @@
       </w:rPr>
     </w:lvl>
   </w:abstractNum>
-  <w:abstractNum w:abstractNumId="1" w15:restartNumberingAfterBreak="0">
+  <w:abstractNum w:abstractNumId="2" w15:restartNumberingAfterBreak="0">
     <w:nsid w:val="459B1C0C"/>
     <w:multiLevelType w:val="hybridMultilevel"/>
     <w:tmpl w:val="4FCA53D0"/>
@@ -16111,7 +16907,7 @@
       </w:rPr>
     </w:lvl>
   </w:abstractNum>
-  <w:abstractNum w:abstractNumId="2" w15:restartNumberingAfterBreak="0">
+  <w:abstractNum w:abstractNumId="3" w15:restartNumberingAfterBreak="0">
     <w:nsid w:val="58062434"/>
     <w:multiLevelType w:val="hybridMultilevel"/>
     <w:tmpl w:val="41BC3AF2"/>
@@ -16230,7 +17026,7 @@
       </w:rPr>
     </w:lvl>
   </w:abstractNum>
-  <w:abstractNum w:abstractNumId="3" w15:restartNumberingAfterBreak="0">
+  <w:abstractNum w:abstractNumId="4" w15:restartNumberingAfterBreak="0">
     <w:nsid w:val="7308581E"/>
     <w:multiLevelType w:val="multilevel"/>
     <w:tmpl w:val="B352FA74"/>
@@ -16349,7 +17145,7 @@
       </w:rPr>
     </w:lvl>
   </w:abstractNum>
-  <w:abstractNum w:abstractNumId="4" w15:restartNumberingAfterBreak="0">
+  <w:abstractNum w:abstractNumId="5" w15:restartNumberingAfterBreak="0">
     <w:nsid w:val="75C71CDC"/>
     <w:multiLevelType w:val="multilevel"/>
     <w:tmpl w:val="A3BE38A4"/>
@@ -16466,7 +17262,7 @@
       </w:rPr>
     </w:lvl>
   </w:abstractNum>
-  <w:abstractNum w:abstractNumId="5" w15:restartNumberingAfterBreak="0">
+  <w:abstractNum w:abstractNumId="6" w15:restartNumberingAfterBreak="0">
     <w:nsid w:val="7C412F1C"/>
     <w:multiLevelType w:val="hybridMultilevel"/>
     <w:tmpl w:val="54BC231E"/>
@@ -16557,40 +17353,43 @@
     </w:lvl>
   </w:abstractNum>
   <w:num w:numId="1" w16cid:durableId="819156668">
+    <w:abstractNumId w:val="3"/>
+  </w:num>
+  <w:num w:numId="2" w16cid:durableId="1208646866">
+    <w:abstractNumId w:val="4"/>
+  </w:num>
+  <w:num w:numId="3" w16cid:durableId="16855530">
+    <w:abstractNumId w:val="1"/>
+  </w:num>
+  <w:num w:numId="4" w16cid:durableId="154498750">
+    <w:abstractNumId w:val="3"/>
+  </w:num>
+  <w:num w:numId="5" w16cid:durableId="1006443196">
+    <w:abstractNumId w:val="4"/>
+  </w:num>
+  <w:num w:numId="6" w16cid:durableId="1134635881">
+    <w:abstractNumId w:val="5"/>
+  </w:num>
+  <w:num w:numId="7" w16cid:durableId="728455146">
+    <w:abstractNumId w:val="3"/>
+  </w:num>
+  <w:num w:numId="8" w16cid:durableId="1080102250">
+    <w:abstractNumId w:val="3"/>
+  </w:num>
+  <w:num w:numId="9" w16cid:durableId="1344631253">
+    <w:abstractNumId w:val="3"/>
+  </w:num>
+  <w:num w:numId="10" w16cid:durableId="1909227167">
+    <w:abstractNumId w:val="3"/>
+  </w:num>
+  <w:num w:numId="11" w16cid:durableId="1164516667">
     <w:abstractNumId w:val="2"/>
   </w:num>
-  <w:num w:numId="2" w16cid:durableId="1208646866">
-    <w:abstractNumId w:val="3"/>
+  <w:num w:numId="12" w16cid:durableId="604845156">
+    <w:abstractNumId w:val="6"/>
   </w:num>
-  <w:num w:numId="3" w16cid:durableId="16855530">
+  <w:num w:numId="13" w16cid:durableId="1990790906">
     <w:abstractNumId w:val="0"/>
-  </w:num>
-  <w:num w:numId="4" w16cid:durableId="154498750">
-    <w:abstractNumId w:val="2"/>
-  </w:num>
-  <w:num w:numId="5" w16cid:durableId="1006443196">
-    <w:abstractNumId w:val="3"/>
-  </w:num>
-  <w:num w:numId="6" w16cid:durableId="1134635881">
-    <w:abstractNumId w:val="4"/>
-  </w:num>
-  <w:num w:numId="7" w16cid:durableId="728455146">
-    <w:abstractNumId w:val="2"/>
-  </w:num>
-  <w:num w:numId="8" w16cid:durableId="1080102250">
-    <w:abstractNumId w:val="2"/>
-  </w:num>
-  <w:num w:numId="9" w16cid:durableId="1344631253">
-    <w:abstractNumId w:val="2"/>
-  </w:num>
-  <w:num w:numId="10" w16cid:durableId="1909227167">
-    <w:abstractNumId w:val="2"/>
-  </w:num>
-  <w:num w:numId="11" w16cid:durableId="1164516667">
-    <w:abstractNumId w:val="1"/>
-  </w:num>
-  <w:num w:numId="12" w16cid:durableId="604845156">
-    <w:abstractNumId w:val="5"/>
   </w:num>
 </w:numbering>
 </file>
@@ -17046,6 +17845,7 @@
   <w:style w:type="character" w:default="1" w:styleId="DefaultParagraphFont">
     <w:name w:val="Default Paragraph Font"/>
     <w:uiPriority w:val="1"/>
+    <w:semiHidden/>
     <w:unhideWhenUsed/>
   </w:style>
   <w:style w:type="table" w:default="1" w:styleId="TableNormal">
@@ -17634,6 +18434,11 @@
       <w:szCs w:val="24"/>
     </w:rPr>
   </w:style>
+  <w:style w:type="character" w:customStyle="1" w:styleId="apple-converted-space">
+    <w:name w:val="apple-converted-space"/>
+    <w:basedOn w:val="DefaultParagraphFont"/>
+    <w:rsid w:val="009A422D"/>
+  </w:style>
 </w:styles>
 </file>
 
@@ -18136,19 +18941,19 @@
 
 <file path=word/glossary/fontTable.xml><?xml version="1.0" encoding="utf-8"?>
 <w:fonts xmlns:mc="http://schemas.openxmlformats.org/markup-compatibility/2006" xmlns:r="http://schemas.openxmlformats.org/officeDocument/2006/relationships" xmlns:w="http://schemas.openxmlformats.org/wordprocessingml/2006/main" xmlns:w14="http://schemas.microsoft.com/office/word/2010/wordml" xmlns:w15="http://schemas.microsoft.com/office/word/2012/wordml" xmlns:w16cex="http://schemas.microsoft.com/office/word/2018/wordml/cex" xmlns:w16cid="http://schemas.microsoft.com/office/word/2016/wordml/cid" xmlns:w16="http://schemas.microsoft.com/office/word/2018/wordml" xmlns:w16sdtdh="http://schemas.microsoft.com/office/word/2020/wordml/sdtdatahash" xmlns:w16sdtfl="http://schemas.microsoft.com/office/word/2024/wordml/sdtformatlock" xmlns:w16se="http://schemas.microsoft.com/office/word/2015/wordml/symex" xmlns:w16du="http://schemas.microsoft.com/office/word/2023/wordml/word16du" mc:Ignorable="w14 w15 w16se w16cid w16 w16cex w16sdtdh w16sdtfl w16du">
+  <w:font w:name="Times New Roman">
+    <w:panose1 w:val="02020603050405020304"/>
+    <w:charset w:val="00"/>
+    <w:family w:val="roman"/>
+    <w:pitch w:val="variable"/>
+    <w:sig w:usb0="E0002EFF" w:usb1="C000785B" w:usb2="00000009" w:usb3="00000000" w:csb0="000001FF" w:csb1="00000000"/>
+  </w:font>
   <w:font w:name="Symbol">
     <w:panose1 w:val="05050102010706020507"/>
     <w:charset w:val="02"/>
     <w:family w:val="decorative"/>
     <w:pitch w:val="variable"/>
     <w:sig w:usb0="00000000" w:usb1="10000000" w:usb2="00000000" w:usb3="00000000" w:csb0="80000000" w:csb1="00000000"/>
-  </w:font>
-  <w:font w:name="Times New Roman">
-    <w:panose1 w:val="02020603050405020304"/>
-    <w:charset w:val="00"/>
-    <w:family w:val="roman"/>
-    <w:pitch w:val="variable"/>
-    <w:sig w:usb0="E0002EFF" w:usb1="C000785B" w:usb2="00000009" w:usb3="00000000" w:csb0="000001FF" w:csb1="00000000"/>
   </w:font>
   <w:font w:name="Courier New">
     <w:panose1 w:val="02070309020205020404"/>
@@ -18270,6 +19075,8 @@
     <w:rsid w:val="00257C1D"/>
     <w:rsid w:val="00283598"/>
     <w:rsid w:val="002A601F"/>
+    <w:rsid w:val="002C5828"/>
+    <w:rsid w:val="002D12F0"/>
     <w:rsid w:val="002E1609"/>
     <w:rsid w:val="002E162F"/>
     <w:rsid w:val="00317078"/>
@@ -18335,6 +19142,7 @@
     <w:rsid w:val="00DC3CE5"/>
     <w:rsid w:val="00E343D0"/>
     <w:rsid w:val="00E40049"/>
+    <w:rsid w:val="00E44291"/>
     <w:rsid w:val="00E572F9"/>
     <w:rsid w:val="00E777E1"/>
     <w:rsid w:val="00E80A47"/>

</xml_diff>